<commit_message>
Debugging density independent functions, improving plotting and visualising density dependence
</commit_message>
<xml_diff>
--- a/Docs/Meta-populations.docx
+++ b/Docs/Meta-populations.docx
@@ -519,25 +519,25 @@
                   <v:fill o:detectmouseclick="t"/>
                   <v:path o:connecttype="none"/>
                 </v:shape>
-                <v:shape id="Ink 92477461" o:spid="_x0000_s1028" type="#_x0000_t75" style="position:absolute;left:3635;top:12789;width:313;height:6415;visibility:visible;mso-wrap-style:square" o:gfxdata="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">
+                <v:shape id="Ink 92477461" o:spid="_x0000_s1028" type="#_x0000_t75" style="position:absolute;left:3635;top:12789;width:313;height:6415;visibility:visible;mso-wrap-style:square" o:gfxdata="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">
                   <v:imagedata r:id="rId37" o:title=""/>
                 </v:shape>
-                <v:shape id="Ink 2077965448" o:spid="_x0000_s1029" type="#_x0000_t75" style="position:absolute;left:2061;top:6932;width:1685;height:3726;visibility:visible;mso-wrap-style:square" o:gfxdata="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">
+                <v:shape id="Ink 2077965448" o:spid="_x0000_s1029" type="#_x0000_t75" style="position:absolute;left:2061;top:6932;width:1685;height:3726;visibility:visible;mso-wrap-style:square" o:gfxdata="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">
                   <v:imagedata r:id="rId38" o:title=""/>
                 </v:shape>
                 <v:shape id="Ink 779847745" o:spid="_x0000_s1030" type="#_x0000_t75" style="position:absolute;left:1824;top:8664;width:1011;height:151;visibility:visible;mso-wrap-style:square" o:gfxdata="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">
                   <v:imagedata r:id="rId39" o:title=""/>
                 </v:shape>
-                <v:shape id="Ink 811176942" o:spid="_x0000_s1031" type="#_x0000_t75" style="position:absolute;left:4351;top:9985;width:1231;height:1688;visibility:visible;mso-wrap-style:square" o:gfxdata="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">
+                <v:shape id="Ink 811176942" o:spid="_x0000_s1031" type="#_x0000_t75" style="position:absolute;left:4351;top:9985;width:1231;height:1688;visibility:visible;mso-wrap-style:square" o:gfxdata="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">
                   <v:imagedata r:id="rId40" o:title=""/>
                 </v:shape>
-                <v:shape id="Ink 1344840202" o:spid="_x0000_s1032" type="#_x0000_t75" style="position:absolute;left:3861;top:16303;width:48755;height:547;visibility:visible;mso-wrap-style:square" o:gfxdata="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">
+                <v:shape id="Ink 1344840202" o:spid="_x0000_s1032" type="#_x0000_t75" style="position:absolute;left:3861;top:16303;width:48755;height:547;visibility:visible;mso-wrap-style:square" o:gfxdata="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">
                   <v:imagedata r:id="rId41" o:title=""/>
                 </v:shape>
-                <v:shape id="Ink 835747813" o:spid="_x0000_s1033" type="#_x0000_t75" style="position:absolute;left:52339;top:13768;width:691;height:5318;visibility:visible;mso-wrap-style:square" o:gfxdata="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">
+                <v:shape id="Ink 835747813" o:spid="_x0000_s1033" type="#_x0000_t75" style="position:absolute;left:52339;top:13768;width:691;height:5318;visibility:visible;mso-wrap-style:square" o:gfxdata="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">
                   <v:imagedata r:id="rId42" o:title=""/>
                 </v:shape>
-                <v:shape id="Ink 104128317" o:spid="_x0000_s1034" type="#_x0000_t75" style="position:absolute;left:50456;top:8667;width:1599;height:2905;visibility:visible;mso-wrap-style:square" o:gfxdata="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">
+                <v:shape id="Ink 104128317" o:spid="_x0000_s1034" type="#_x0000_t75" style="position:absolute;left:50456;top:8667;width:1599;height:2905;visibility:visible;mso-wrap-style:square" o:gfxdata="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">
                   <v:imagedata r:id="rId43" o:title=""/>
                 </v:shape>
                 <v:shape id="Ink 1592978462" o:spid="_x0000_s1035" type="#_x0000_t75" style="position:absolute;left:49689;top:10014;width:1635;height:291;visibility:visible;mso-wrap-style:square" o:gfxdata="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">
@@ -546,76 +546,76 @@
                 <v:shape id="Ink 101560594" o:spid="_x0000_s1036" type="#_x0000_t75" style="position:absolute;left:52339;top:11202;width:839;height:1155;visibility:visible;mso-wrap-style:square" o:gfxdata="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">
                   <v:imagedata r:id="rId45" o:title=""/>
                 </v:shape>
-                <v:shape id="Ink 1320656223" o:spid="_x0000_s1037" type="#_x0000_t75" style="position:absolute;left:52533;top:12033;width:990;height:295;visibility:visible;mso-wrap-style:square" o:gfxdata="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">
+                <v:shape id="Ink 1320656223" o:spid="_x0000_s1037" type="#_x0000_t75" style="position:absolute;left:52533;top:12033;width:990;height:295;visibility:visible;mso-wrap-style:square" o:gfxdata="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">
                   <v:imagedata r:id="rId46" o:title=""/>
                 </v:shape>
-                <v:shape id="Ink 770352982" o:spid="_x0000_s1038" type="#_x0000_t75" style="position:absolute;left:11623;top:14888;width:241;height:2898;visibility:visible;mso-wrap-style:square" o:gfxdata="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">
+                <v:shape id="Ink 770352982" o:spid="_x0000_s1038" type="#_x0000_t75" style="position:absolute;left:11623;top:14888;width:241;height:2898;visibility:visible;mso-wrap-style:square" o:gfxdata="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">
                   <v:imagedata r:id="rId47" o:title=""/>
                 </v:shape>
-                <v:shape id="Ink 1267672213" o:spid="_x0000_s1039" type="#_x0000_t75" style="position:absolute;left:7969;top:19528;width:1195;height:1815;visibility:visible;mso-wrap-style:square" o:gfxdata="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">
+                <v:shape id="Ink 1267672213" o:spid="_x0000_s1039" type="#_x0000_t75" style="position:absolute;left:7969;top:19528;width:1195;height:1815;visibility:visible;mso-wrap-style:square" o:gfxdata="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">
                   <v:imagedata r:id="rId48" o:title=""/>
                 </v:shape>
-                <v:shape id="Ink 943662521" o:spid="_x0000_s1040" type="#_x0000_t75" style="position:absolute;left:9449;top:20065;width:914;height:1663;visibility:visible;mso-wrap-style:square" o:gfxdata="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">
+                <v:shape id="Ink 943662521" o:spid="_x0000_s1040" type="#_x0000_t75" style="position:absolute;left:9449;top:20065;width:914;height:1663;visibility:visible;mso-wrap-style:square" o:gfxdata="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">
                   <v:imagedata r:id="rId49" o:title=""/>
                 </v:shape>
-                <v:shape id="Ink 349513586" o:spid="_x0000_s1041" type="#_x0000_t75" style="position:absolute;left:10680;top:19878;width:698;height:1508;visibility:visible;mso-wrap-style:square" o:gfxdata="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">
+                <v:shape id="Ink 349513586" o:spid="_x0000_s1041" type="#_x0000_t75" style="position:absolute;left:10680;top:19877;width:698;height:1509;visibility:visible;mso-wrap-style:square" o:gfxdata="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">
                   <v:imagedata r:id="rId50" o:title=""/>
                 </v:shape>
-                <v:shape id="Ink 109883749" o:spid="_x0000_s1042" type="#_x0000_t75" style="position:absolute;left:11540;top:19723;width:1030;height:1512;visibility:visible;mso-wrap-style:square" o:gfxdata="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">
+                <v:shape id="Ink 109883749" o:spid="_x0000_s1042" type="#_x0000_t75" style="position:absolute;left:11540;top:19723;width:1029;height:1512;visibility:visible;mso-wrap-style:square" o:gfxdata="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">
                   <v:imagedata r:id="rId51" o:title=""/>
                 </v:shape>
                 <v:shape id="Ink 1955052069" o:spid="_x0000_s1043" type="#_x0000_t75" style="position:absolute;left:17379;top:16015;width:274;height:1159;visibility:visible;mso-wrap-style:square" o:gfxdata="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">
                   <v:imagedata r:id="rId52" o:title=""/>
                 </v:shape>
-                <v:shape id="Ink 260248086" o:spid="_x0000_s1044" type="#_x0000_t75" style="position:absolute;left:15093;top:18916;width:972;height:1916;visibility:visible;mso-wrap-style:square" o:gfxdata="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">
+                <v:shape id="Ink 260248086" o:spid="_x0000_s1044" type="#_x0000_t75" style="position:absolute;left:15093;top:18916;width:972;height:1916;visibility:visible;mso-wrap-style:square" o:gfxdata="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">
                   <v:imagedata r:id="rId53" o:title=""/>
                 </v:shape>
-                <v:shape id="Ink 1633593794" o:spid="_x0000_s1045" type="#_x0000_t75" style="position:absolute;left:15907;top:19726;width:2153;height:1278;visibility:visible;mso-wrap-style:square" o:gfxdata="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">
+                <v:shape id="Ink 1633593794" o:spid="_x0000_s1045" type="#_x0000_t75" style="position:absolute;left:15907;top:19726;width:2153;height:1278;visibility:visible;mso-wrap-style:square" o:gfxdata="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">
                   <v:imagedata r:id="rId54" o:title=""/>
                 </v:shape>
-                <v:shape id="Ink 1749567801" o:spid="_x0000_s1046" type="#_x0000_t75" style="position:absolute;left:18420;top:18855;width:1119;height:2099;visibility:visible;mso-wrap-style:square" o:gfxdata="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">
+                <v:shape id="Ink 1749567801" o:spid="_x0000_s1046" type="#_x0000_t75" style="position:absolute;left:18419;top:18855;width:1121;height:2099;visibility:visible;mso-wrap-style:square" o:gfxdata="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">
                   <v:imagedata r:id="rId55" o:title=""/>
                 </v:shape>
-                <v:shape id="Ink 235111432" o:spid="_x0000_s1047" type="#_x0000_t75" style="position:absolute;left:19759;top:16861;width:31068;height:1440;visibility:visible;mso-wrap-style:square" o:gfxdata="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">
+                <v:shape id="Ink 235111432" o:spid="_x0000_s1047" type="#_x0000_t75" style="position:absolute;left:19759;top:16861;width:31068;height:1440;visibility:visible;mso-wrap-style:square" o:gfxdata="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">
                   <v:imagedata r:id="rId56" o:title=""/>
                 </v:shape>
-                <v:shape id="Ink 1702041107" o:spid="_x0000_s1048" type="#_x0000_t75" style="position:absolute;left:19899;top:16634;width:1534;height:2110;visibility:visible;mso-wrap-style:square" o:gfxdata="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">
+                <v:shape id="Ink 1702041107" o:spid="_x0000_s1048" type="#_x0000_t75" style="position:absolute;left:19899;top:16634;width:1534;height:2110;visibility:visible;mso-wrap-style:square" o:gfxdata="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">
                   <v:imagedata r:id="rId57" o:title=""/>
                 </v:shape>
-                <v:shape id="Ink 322281722" o:spid="_x0000_s1049" type="#_x0000_t75" style="position:absolute;left:23975;top:19975;width:2116;height:1929;visibility:visible;mso-wrap-style:square" o:gfxdata="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">
+                <v:shape id="Ink 322281722" o:spid="_x0000_s1049" type="#_x0000_t75" style="position:absolute;left:23975;top:19975;width:2116;height:1929;visibility:visible;mso-wrap-style:square" o:gfxdata="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">
                   <v:imagedata r:id="rId58" o:title=""/>
                 </v:shape>
-                <v:shape id="Ink 1092419558" o:spid="_x0000_s1050" type="#_x0000_t75" style="position:absolute;left:26171;top:20504;width:2397;height:1494;visibility:visible;mso-wrap-style:square" o:gfxdata="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">
+                <v:shape id="Ink 1092419558" o:spid="_x0000_s1050" type="#_x0000_t75" style="position:absolute;left:26171;top:20504;width:2397;height:1494;visibility:visible;mso-wrap-style:square" o:gfxdata="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">
                   <v:imagedata r:id="rId59" o:title=""/>
                 </v:shape>
-                <v:shape id="Ink 404477437" o:spid="_x0000_s1051" type="#_x0000_t75" style="position:absolute;left:28982;top:20806;width:1141;height:1239;visibility:visible;mso-wrap-style:square" o:gfxdata="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">
+                <v:shape id="Ink 404477437" o:spid="_x0000_s1051" type="#_x0000_t75" style="position:absolute;left:28982;top:20806;width:1141;height:1239;visibility:visible;mso-wrap-style:square" o:gfxdata="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">
                   <v:imagedata r:id="rId60" o:title=""/>
                 </v:shape>
-                <v:shape id="Ink 886082881" o:spid="_x0000_s1052" type="#_x0000_t75" style="position:absolute;left:30332;top:21408;width:331;height:903;visibility:visible;mso-wrap-style:square" o:gfxdata="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">
+                <v:shape id="Ink 886082881" o:spid="_x0000_s1052" type="#_x0000_t75" style="position:absolute;left:30332;top:21408;width:331;height:903;visibility:visible;mso-wrap-style:square" o:gfxdata="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">
                   <v:imagedata r:id="rId61" o:title=""/>
                 </v:shape>
-                <v:shape id="Ink 1576081196" o:spid="_x0000_s1053" type="#_x0000_t75" style="position:absolute;left:30530;top:20162;width:151;height:166;visibility:visible;mso-wrap-style:square" o:gfxdata="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">
+                <v:shape id="Ink 1576081196" o:spid="_x0000_s1053" type="#_x0000_t75" style="position:absolute;left:30530;top:20167;width:151;height:156;visibility:visible;mso-wrap-style:square" o:gfxdata="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">
                   <v:imagedata r:id="rId62" o:title=""/>
                 </v:shape>
-                <v:shape id="Ink 1376182977" o:spid="_x0000_s1054" type="#_x0000_t75" style="position:absolute;left:30725;top:20904;width:2127;height:1432;visibility:visible;mso-wrap-style:square" o:gfxdata="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">
+                <v:shape id="Ink 1376182977" o:spid="_x0000_s1054" type="#_x0000_t75" style="position:absolute;left:30725;top:20904;width:2127;height:1432;visibility:visible;mso-wrap-style:square" o:gfxdata="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">
                   <v:imagedata r:id="rId63" o:title=""/>
                 </v:shape>
-                <v:shape id="Ink 1699044281" o:spid="_x0000_s1055" type="#_x0000_t75" style="position:absolute;left:33561;top:20065;width:1340;height:2084;visibility:visible;mso-wrap-style:square" o:gfxdata="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">
+                <v:shape id="Ink 1699044281" o:spid="_x0000_s1055" type="#_x0000_t75" style="position:absolute;left:33561;top:20065;width:1340;height:2084;visibility:visible;mso-wrap-style:square" o:gfxdata="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">
                   <v:imagedata r:id="rId64" o:title=""/>
                 </v:shape>
-                <v:shape id="Ink 154495301" o:spid="_x0000_s1056" type="#_x0000_t75" style="position:absolute;left:35131;top:20979;width:1469;height:943;visibility:visible;mso-wrap-style:square" o:gfxdata="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">
+                <v:shape id="Ink 154495301" o:spid="_x0000_s1056" type="#_x0000_t75" style="position:absolute;left:35131;top:20979;width:1469;height:943;visibility:visible;mso-wrap-style:square" o:gfxdata="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">
                   <v:imagedata r:id="rId65" o:title=""/>
                 </v:shape>
-                <v:shape id="Ink 1942467071" o:spid="_x0000_s1057" type="#_x0000_t75" style="position:absolute;left:35372;top:21505;width:1595;height:2991;visibility:visible;mso-wrap-style:square" o:gfxdata="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">
+                <v:shape id="Ink 1942467071" o:spid="_x0000_s1057" type="#_x0000_t75" style="position:absolute;left:35372;top:21505;width:1595;height:2991;visibility:visible;mso-wrap-style:square" o:gfxdata="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">
                   <v:imagedata r:id="rId66" o:title=""/>
                 </v:shape>
-                <v:shape id="Ink 1517664970" o:spid="_x0000_s1058" type="#_x0000_t75" style="position:absolute;left:37154;top:20742;width:907;height:1076;visibility:visible;mso-wrap-style:square" o:gfxdata="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">
+                <v:shape id="Ink 1517664970" o:spid="_x0000_s1058" type="#_x0000_t75" style="position:absolute;left:37154;top:20742;width:907;height:1076;visibility:visible;mso-wrap-style:square" o:gfxdata="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">
                   <v:imagedata r:id="rId67" o:title=""/>
                 </v:shape>
-                <v:shape id="Ink 510786032" o:spid="_x0000_s1059" type="#_x0000_t75" style="position:absolute;left:38036;top:21040;width:1390;height:944;visibility:visible;mso-wrap-style:square" o:gfxdata="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">
+                <v:shape id="Ink 510786032" o:spid="_x0000_s1059" type="#_x0000_t75" style="position:absolute;left:38036;top:21041;width:1390;height:942;visibility:visible;mso-wrap-style:square" o:gfxdata="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">
                   <v:imagedata r:id="rId68" o:title=""/>
                 </v:shape>
-                <v:shape id="Ink 39819418" o:spid="_x0000_s1060" type="#_x0000_t75" style="position:absolute;left:39631;top:20320;width:2329;height:1635;visibility:visible;mso-wrap-style:square" o:gfxdata="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">
+                <v:shape id="Ink 39819418" o:spid="_x0000_s1060" type="#_x0000_t75" style="position:absolute;left:39631;top:20320;width:2329;height:1635;visibility:visible;mso-wrap-style:square" o:gfxdata="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">
                   <v:imagedata r:id="rId69" o:title=""/>
                 </v:shape>
                 <v:rect id="Rectangle 75118619" o:spid="_x0000_s1061" style="position:absolute;left:7365;top:1702;width:14140;height:6087;visibility:visible;mso-wrap-style:square;v-text-anchor:middle" o:gfxdata="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" filled="f" strokecolor="#4ea72e [3209]" strokeweight="1.5pt">
@@ -692,7 +692,15 @@
       </w:r>
     </w:p>
     <w:p>
-      <w:r>
+      <w:pPr>
+        <w:rPr>
+          <w:lang w:val="pt-BR"/>
+        </w:rPr>
+      </w:pPr>
+      <w:r>
+        <w:rPr>
+          <w:lang w:val="pt-BR"/>
+        </w:rPr>
         <w:t>Matrix diagonal = normal MPM rates</w:t>
       </w:r>
     </w:p>

</xml_diff>

<commit_message>
Improving dispersal, planning new parameters
</commit_message>
<xml_diff>
--- a/Docs/Meta-populations.docx
+++ b/Docs/Meta-populations.docx
@@ -758,7 +758,13 @@
     </w:p>
     <w:p>
       <w:r>
-        <w:t># L = 1 (max value, prob bound between 0 and 1)</w:t>
+        <w:t xml:space="preserve"># L = 1 (max value, </w:t>
+      </w:r>
+      <w:r>
+        <w:t>0.3</w:t>
+      </w:r>
+      <w:r>
+        <w:t>)</w:t>
       </w:r>
     </w:p>
     <w:p>

</xml_diff>